<commit_message>
docs: v1.9 — clarifications promoted to Section 3, all references renumbered
Co-Authored-By: Claude Fable 5 <noreply@anthropic.com>
</commit_message>
<xml_diff>
--- a/CMC-Symvasi-Xorigias-SXEDIO-BI.docx
+++ b/CMC-Symvasi-Xorigias-SXEDIO-BI.docx
@@ -174,7 +174,7 @@
           <w:sz w:val="21"/>
           <w:szCs w:val="21"/>
         </w:rPr>
-        <w:t xml:space="preserve">1.2 Η Λέσχη διαπίστωσε την ανάγκη αναβάθμισης της ψηφιακής της παρουσίας και δημιουργίας πλατφόρμας μελών με ελεγχόμενη πρόσβαση, όπως περιγράφεται στο έγγραφο «Αναβάθμιση Ψηφιακής Παρουσίας και Πλατφόρμα Μελών», έκδοση 1.7 (εφεξής «το Έγγραφο Εύρους»), που προσαρτάται ως Παράρτημα Α και αποτελεί αναπόσπαστο μέρος της παρούσας.</w:t>
+        <w:t xml:space="preserve">1.2 Η Λέσχη διαπίστωσε την ανάγκη αναβάθμισης της ψηφιακής της παρουσίας και δημιουργίας πλατφόρμας μελών με ελεγχόμενη πρόσβαση, όπως περιγράφεται στο έγγραφο «Αναβάθμιση Ψηφιακής Παρουσίας και Πλατφόρμα Μελών», έκδοση 1.9 (εφεξής «το Έγγραφο Εύρους»), που προσαρτάται ως Παράρτημα Α και αποτελεί αναπόσπαστο μέρος της παρούσας.</w:t>
       </w:r>
     </w:p>
     <w:p>
@@ -217,7 +217,7 @@
           <w:sz w:val="21"/>
           <w:szCs w:val="21"/>
         </w:rPr>
-        <w:t xml:space="preserve">2.1 Ο Χορηγός αναλαμβάνει, με δικές του δαπάνες: (α) τον σχεδιασμό και την ανάπτυξη της δημόσιας ιστοσελίδας, της Πύλης Φυσικών Μελών και της Πύλης Εταιρειών-Μελών, κατά την Ενότητα 6 του Παραρτήματος Α· (β) τη μετάπτωση δεδομένων και ιστορικού αρχείου κατά την Ενότητα 9· (γ) την παράδοση τεκμηρίωσης διαχείρισης στην ελληνική γλώσσα και την εκπαίδευση δύο (2) προσώπων· (δ) υποστήριξη παραγωγής διάρκειας δύο (2) εβδομάδων από τη θέση σε λειτουργία.</w:t>
+        <w:t xml:space="preserve">2.1 Ο Χορηγός αναλαμβάνει, με δικές του δαπάνες: (α) τον σχεδιασμό και την ανάπτυξη της δημόσιας ιστοσελίδας, της Πύλης Φυσικών Μελών και της Πύλης Εταιρειών-Μελών, κατά την Ενότητα 7 του Παραρτήματος Α· (β) τη μετάπτωση δεδομένων και ιστορικού αρχείου κατά την Ενότητα 10· (γ) την παράδοση τεκμηρίωσης διαχείρισης στην ελληνική γλώσσα και την εκπαίδευση δύο (2) προσώπων· (δ) υποστήριξη παραγωγής διάρκειας δύο (2) εβδομάδων από τη θέση σε λειτουργία.</w:t>
       </w:r>
     </w:p>
     <w:p>
@@ -273,7 +273,7 @@
           <w:sz w:val="21"/>
           <w:szCs w:val="21"/>
         </w:rPr>
-        <w:t xml:space="preserve">3.2 Το ενδεικτικό ετήσιο λειτουργικό κόστος αποτυπώνεται στην Ενότητα 14 του Παραρτήματος Α. Η Λέσχη δηλώνει ότι έλαβε γνώση αυτού και δεσμεύεται να το εγγράψει σε διακριτή γραμμή του ετήσιου προϋπολογισμού της.</w:t>
+        <w:t xml:space="preserve">3.2 Το ενδεικτικό ετήσιο λειτουργικό κόστος αποτυπώνεται στην Ενότητα 15 του Παραρτήματος Α. Η Λέσχη δηλώνει ότι έλαβε γνώση αυτού και δεσμεύεται να το εγγράψει σε διακριτή γραμμή του ετήσιου προϋπολογισμού της.</w:t>
       </w:r>
     </w:p>
     <w:p>
@@ -497,7 +497,7 @@
           <w:sz w:val="21"/>
           <w:szCs w:val="21"/>
         </w:rPr>
-        <w:t xml:space="preserve">7.2 Η Λέσχη τηρεί τα παράθυρα απόκρισης της Ενότητας 13 του Παραρτήματος Α. Καθυστέρηση πέραν αυτών μετατοπίζει αναλόγως το χρονοδιάγραμμα παράδοσης, χωρίς άλλη συνέπεια για τον Χορηγό ή τον Υλοποιητή.</w:t>
+        <w:t xml:space="preserve">7.2 Η Λέσχη τηρεί τα παράθυρα απόκρισης της Ενότητας 14 του Παραρτήματος Α. Καθυστέρηση πέραν αυτών μετατοπίζει αναλόγως το χρονοδιάγραμμα παράδοσης, χωρίς άλλη συνέπεια για τον Χορηγό ή τον Υλοποιητή.</w:t>
       </w:r>
     </w:p>
     <w:p>
@@ -553,7 +553,7 @@
           <w:sz w:val="21"/>
           <w:szCs w:val="21"/>
         </w:rPr>
-        <w:t xml:space="preserve">8.1 Η τεχνική εργασία του Υλοποιητή ανέρχεται σε δεκαπέντε (15) εργάσιμες ημέρες, κατανεμημένες κατά τις φάσεις της Ενότητας 13 του Παραρτήματος Α.</w:t>
+        <w:t xml:space="preserve">8.1 Η τεχνική εργασία του Υλοποιητή ανέρχεται σε δεκαπέντε (15) εργάσιμες ημέρες, κατανεμημένες κατά τις φάσεις της Ενότητας 14 του Παραρτήματος Α.</w:t>
       </w:r>
     </w:p>
     <w:p>
@@ -1185,7 +1185,7 @@
           <w:sz w:val="21"/>
           <w:szCs w:val="21"/>
         </w:rPr>
-        <w:t xml:space="preserve">Το Παράρτημα Α αποτελείται από το έγγραφο «Αναβάθμιση Ψηφιακής Παρουσίας και Πλατφόρμα Μελών — Πρόταση Έργου, Έκδοση 1.7», ημερομηνίας 30 Ιουλίου 2026, το οποίο μονογράφεται από αμφότερα τα μέρη. Σε περίπτωση αντιφάσεως, υπερισχύουν οι όροι της παρούσας.</w:t>
+        <w:t xml:space="preserve">Το Παράρτημα Α αποτελείται από το έγγραφο «Αναβάθμιση Ψηφιακής Παρουσίας και Πλατφόρμα Μελών — Πρόταση Έργου, Έκδοση 1.9», ημερομηνίας 30 Ιουλίου 2026, το οποίο μονογράφεται από αμφότερα τα μέρη. Σε περίπτωση αντιφάσεως, υπερισχύουν οι όροι της παρούσας.</w:t>
       </w:r>
     </w:p>
     <w:p>
@@ -1384,7 +1384,7 @@
           <w:sz w:val="21"/>
           <w:szCs w:val="21"/>
         </w:rPr>
-        <w:t xml:space="preserve">1.2 The Club has identified the need to upgrade its digital presence and to create a members platform with controlled access, as described in the document “Digital Presence Upgrade and Members Platform”, version 1.7 (the “Scope Document”), attached as Annex A and forming an integral part hereof.</w:t>
+        <w:t xml:space="preserve">1.2 The Club has identified the need to upgrade its digital presence and to create a members platform with controlled access, as described in the document “Digital Presence Upgrade and Members Platform”, version 1.9 (the “Scope Document”), attached as Annex A and forming an integral part hereof.</w:t>
       </w:r>
     </w:p>
     <w:p>
@@ -1427,7 +1427,7 @@
           <w:sz w:val="21"/>
           <w:szCs w:val="21"/>
         </w:rPr>
-        <w:t xml:space="preserve">2.1 The Sponsor undertakes, at its own expense: (a) the design and development of the public website, the Members Portal and the Corporate Members Portal, per Section 6 of Annex A; (b) migration of data and the historical archive per Section 9; (c) delivery of administration documentation in Greek and training of two (2) persons; (d) production support for two (2) weeks from go-live.</w:t>
+        <w:t xml:space="preserve">2.1 The Sponsor undertakes, at its own expense: (a) the design and development of the public website, the Members Portal and the Corporate Members Portal, per Section 7 of Annex A; (b) migration of data and the historical archive per Section 10; (c) delivery of administration documentation in Greek and training of two (2) persons; (d) production support for two (2) weeks from go-live.</w:t>
       </w:r>
     </w:p>
     <w:p>
@@ -1483,7 +1483,7 @@
           <w:sz w:val="21"/>
           <w:szCs w:val="21"/>
         </w:rPr>
-        <w:t xml:space="preserve">3.2 The indicative annual operating cost is set out in Section 14 of Annex A. The Club acknowledges it and undertakes to enter it as a distinct line in its annual budget.</w:t>
+        <w:t xml:space="preserve">3.2 The indicative annual operating cost is set out in Section 15 of Annex A. The Club acknowledges it and undertakes to enter it as a distinct line in its annual budget.</w:t>
       </w:r>
     </w:p>
     <w:p>
@@ -1707,7 +1707,7 @@
           <w:sz w:val="21"/>
           <w:szCs w:val="21"/>
         </w:rPr>
-        <w:t xml:space="preserve">7.2 The Club observes the response windows in Section 13 of Annex A. Delay beyond those windows shifts the delivery schedule accordingly, with no other consequence for the Sponsor or the Implementer.</w:t>
+        <w:t xml:space="preserve">7.2 The Club observes the response windows in Section 14 of Annex A. Delay beyond those windows shifts the delivery schedule accordingly, with no other consequence for the Sponsor or the Implementer.</w:t>
       </w:r>
     </w:p>
     <w:p>
@@ -1763,7 +1763,7 @@
           <w:sz w:val="21"/>
           <w:szCs w:val="21"/>
         </w:rPr>
-        <w:t xml:space="preserve">8.1 The Implementer's technical work amounts to fifteen (15) working days, distributed across the phases in Section 13 of Annex A.</w:t>
+        <w:t xml:space="preserve">8.1 The Implementer's technical work amounts to fifteen (15) working days, distributed across the phases in Section 14 of Annex A.</w:t>
       </w:r>
     </w:p>
     <w:p>
@@ -2395,7 +2395,7 @@
           <w:sz w:val="21"/>
           <w:szCs w:val="21"/>
         </w:rPr>
-        <w:t xml:space="preserve">Annex A consists of the document “Digital Presence Upgrade and Members Platform — Project Proposal, Version 1.7”, dated 30 July 2026, initialled by both parties. In the event of conflict, the terms of this agreement prevail.</w:t>
+        <w:t xml:space="preserve">Annex A consists of the document “Digital Presence Upgrade and Members Platform — Project Proposal, Version 1.9”, dated 30 July 2026, initialled by both parties. In the event of conflict, the terms of this agreement prevail.</w:t>
       </w:r>
     </w:p>
     <w:p>

</xml_diff>

<commit_message>
docs: v2.2 — fix agreement cross-reference to Annex A version
Co-Authored-By: Claude Fable 5 <noreply@anthropic.com>
</commit_message>
<xml_diff>
--- a/CMC-Symvasi-Xorigias-SXEDIO-BI.docx
+++ b/CMC-Symvasi-Xorigias-SXEDIO-BI.docx
@@ -174,7 +174,7 @@
           <w:sz w:val="21"/>
           <w:szCs w:val="21"/>
         </w:rPr>
-        <w:t xml:space="preserve">1.2 Η Λέσχη διαπίστωσε την ανάγκη αναβάθμισης της ψηφιακής της παρουσίας και δημιουργίας πλατφόρμας μελών με ελεγχόμενη πρόσβαση, όπως περιγράφεται στο έγγραφο «Αναβάθμιση Ψηφιακής Παρουσίας και Πλατφόρμα Μελών», έκδοση 1.9 (εφεξής «το Έγγραφο Εύρους»), που προσαρτάται ως Παράρτημα Α και αποτελεί αναπόσπαστο μέρος της παρούσας.</w:t>
+        <w:t xml:space="preserve">1.2 Η Λέσχη διαπίστωσε την ανάγκη αναβάθμισης της ψηφιακής της παρουσίας και δημιουργίας πλατφόρμας μελών με ελεγχόμενη πρόσβαση, όπως περιγράφεται στο έγγραφο «Αναβάθμιση Ψηφιακής Παρουσίας και Πλατφόρμα Μελών», έκδοση 2.2 (εφεξής «το Έγγραφο Εύρους»), που προσαρτάται ως Παράρτημα Α και αποτελεί αναπόσπαστο μέρος της παρούσας.</w:t>
       </w:r>
     </w:p>
     <w:p>
@@ -1185,7 +1185,7 @@
           <w:sz w:val="21"/>
           <w:szCs w:val="21"/>
         </w:rPr>
-        <w:t xml:space="preserve">Το Παράρτημα Α αποτελείται από το έγγραφο «Αναβάθμιση Ψηφιακής Παρουσίας και Πλατφόρμα Μελών — Πρόταση Έργου, Έκδοση 1.9», ημερομηνίας 30 Ιουλίου 2026, το οποίο μονογράφεται από αμφότερα τα μέρη. Σε περίπτωση αντιφάσεως, υπερισχύουν οι όροι της παρούσας.</w:t>
+        <w:t xml:space="preserve">Το Παράρτημα Α αποτελείται από το έγγραφο «Αναβάθμιση Ψηφιακής Παρουσίας και Πλατφόρμα Μελών — Πρόταση Έργου, Έκδοση 2.2», ημερομηνίας 30 Ιουλίου 2026, το οποίο μονογράφεται από αμφότερα τα μέρη. Σε περίπτωση αντιφάσεως, υπερισχύουν οι όροι της παρούσας.</w:t>
       </w:r>
     </w:p>
     <w:p>
@@ -1384,7 +1384,7 @@
           <w:sz w:val="21"/>
           <w:szCs w:val="21"/>
         </w:rPr>
-        <w:t xml:space="preserve">1.2 The Club has identified the need to upgrade its digital presence and to create a members platform with controlled access, as described in the document “Digital Presence Upgrade and Members Platform”, version 1.9 (the “Scope Document”), attached as Annex A and forming an integral part hereof.</w:t>
+        <w:t xml:space="preserve">1.2 The Club has identified the need to upgrade its digital presence and to create a members platform with controlled access, as described in the document “Digital Presence Upgrade and Members Platform”, version 2.2 (the “Scope Document”), attached as Annex A and forming an integral part hereof.</w:t>
       </w:r>
     </w:p>
     <w:p>
@@ -2395,7 +2395,7 @@
           <w:sz w:val="21"/>
           <w:szCs w:val="21"/>
         </w:rPr>
-        <w:t xml:space="preserve">Annex A consists of the document “Digital Presence Upgrade and Members Platform — Project Proposal, Version 1.9”, dated 30 July 2026, initialled by both parties. In the event of conflict, the terms of this agreement prevail.</w:t>
+        <w:t xml:space="preserve">Annex A consists of the document “Digital Presence Upgrade and Members Platform — Project Proposal, Version 2.2”, dated 30 July 2026, initialled by both parties. In the event of conflict, the terms of this agreement prevail.</w:t>
       </w:r>
     </w:p>
     <w:p>

</xml_diff>